<commit_message>
Fix: sertakan asesmen Presentasi di ekspor Word (word-1 & word-2)
</commit_message>
<xml_diff>
--- a/src/templates/template.docx
+++ b/src/templates/template.docx
@@ -1,6 +1,6 @@
 
 <file path=word/document.xml><?xml version="1.0" encoding="utf-8"?>
-<w:document xmlns:wpc="http://schemas.microsoft.com/office/word/2010/wordprocessingCanvas" xmlns:cx="http://schemas.microsoft.com/office/drawing/2014/chartex" xmlns:cx1="http://schemas.microsoft.com/office/drawing/2015/9/8/chartex" xmlns:cx2="http://schemas.microsoft.com/office/drawing/2015/10/21/chartex" xmlns:cx3="http://schemas.microsoft.com/office/drawing/2016/5/9/chartex" xmlns:cx4="http://schemas.microsoft.com/office/drawing/2016/5/10/chartex" xmlns:cx5="http://schemas.microsoft.com/office/drawing/2016/5/11/chartex" xmlns:cx6="http://schemas.microsoft.com/office/drawing/2016/5/12/chartex" xmlns:cx7="http://schemas.microsoft.com/office/drawing/2016/5/13/chartex" xmlns:cx8="http://schemas.microsoft.com/office/drawing/2016/5/14/chartex" xmlns:mc="http://schemas.openxmlformats.org/markup-compatibility/2006" xmlns:aink="http://schemas.microsoft.com/office/drawing/2016/ink" xmlns:am3d="http://schemas.microsoft.com/office/drawing/2017/model3d" xmlns:o="urn:schemas-microsoft-com:office:office" xmlns:r="http://schemas.openxmlformats.org/officeDocument/2006/relationships" xmlns:m="http://schemas.openxmlformats.org/officeDocument/2006/math" xmlns:v="urn:schemas-microsoft-com:vml" xmlns:wp14="http://schemas.microsoft.com/office/word/2010/wordprocessingDrawing" xmlns:wp="http://schemas.openxmlformats.org/drawingml/2006/wordprocessingDrawing" xmlns:w10="urn:schemas-microsoft-com:office:word" xmlns:w="http://schemas.openxmlformats.org/wordprocessingml/2006/main" xmlns:w14="http://schemas.microsoft.com/office/word/2010/wordml" xmlns:w15="http://schemas.microsoft.com/office/word/2012/wordml" xmlns:w16cex="http://schemas.microsoft.com/office/word/2018/wordml/cex" xmlns:w16cid="http://schemas.microsoft.com/office/word/2016/wordml/cid" xmlns:w16="http://schemas.microsoft.com/office/word/2018/wordml" xmlns:w16se="http://schemas.microsoft.com/office/word/2015/wordml/symex" xmlns:wpg="http://schemas.microsoft.com/office/word/2010/wordprocessingGroup" xmlns:wpi="http://schemas.microsoft.com/office/word/2010/wordprocessingInk" xmlns:wne="http://schemas.microsoft.com/office/word/2006/wordml" xmlns:wps="http://schemas.microsoft.com/office/word/2010/wordprocessingShape" mc:Ignorable="w14 w15 w16se w16cid w16 w16cex wp14">
+<w:document xmlns:wpc="http://schemas.microsoft.com/office/word/2010/wordprocessingCanvas" xmlns:cx="http://schemas.microsoft.com/office/drawing/2014/chartex" xmlns:cx1="http://schemas.microsoft.com/office/drawing/2015/9/8/chartex" xmlns:cx2="http://schemas.microsoft.com/office/drawing/2015/10/21/chartex" xmlns:cx3="http://schemas.microsoft.com/office/drawing/2016/5/9/chartex" xmlns:cx4="http://schemas.microsoft.com/office/drawing/2016/5/10/chartex" xmlns:cx5="http://schemas.microsoft.com/office/drawing/2016/5/11/chartex" xmlns:cx6="http://schemas.microsoft.com/office/drawing/2016/5/12/chartex" xmlns:cx7="http://schemas.microsoft.com/office/drawing/2016/5/13/chartex" xmlns:cx8="http://schemas.microsoft.com/office/drawing/2016/5/14/chartex" xmlns:mc="http://schemas.openxmlformats.org/markup-compatibility/2006" xmlns:aink="http://schemas.microsoft.com/office/drawing/2016/ink" xmlns:am3d="http://schemas.microsoft.com/office/drawing/2017/model3d" xmlns:o="urn:schemas-microsoft-com:office:office" xmlns:oel="http://schemas.microsoft.com/office/2019/extlst" xmlns:r="http://schemas.openxmlformats.org/officeDocument/2006/relationships" xmlns:m="http://schemas.openxmlformats.org/officeDocument/2006/math" xmlns:v="urn:schemas-microsoft-com:vml" xmlns:wp14="http://schemas.microsoft.com/office/word/2010/wordprocessingDrawing" xmlns:wp="http://schemas.openxmlformats.org/drawingml/2006/wordprocessingDrawing" xmlns:w10="urn:schemas-microsoft-com:office:word" xmlns:w="http://schemas.openxmlformats.org/wordprocessingml/2006/main" xmlns:w14="http://schemas.microsoft.com/office/word/2010/wordml" xmlns:w15="http://schemas.microsoft.com/office/word/2012/wordml" xmlns:w16cex="http://schemas.microsoft.com/office/word/2018/wordml/cex" xmlns:w16cid="http://schemas.microsoft.com/office/word/2016/wordml/cid" xmlns:w16="http://schemas.microsoft.com/office/word/2018/wordml" xmlns:w16du="http://schemas.microsoft.com/office/word/2023/wordml/word16du" xmlns:w16sdtdh="http://schemas.microsoft.com/office/word/2020/wordml/sdtdatahash" xmlns:w16sdtfl="http://schemas.microsoft.com/office/word/2024/wordml/sdtformatlock" xmlns:w16se="http://schemas.microsoft.com/office/word/2015/wordml/symex" xmlns:wpg="http://schemas.microsoft.com/office/word/2010/wordprocessingGroup" xmlns:wpi="http://schemas.microsoft.com/office/word/2010/wordprocessingInk" xmlns:wne="http://schemas.microsoft.com/office/word/2006/wordml" xmlns:wps="http://schemas.microsoft.com/office/word/2010/wordprocessingShape" mc:Ignorable="w14 w15 w16se w16cid w16 w16cex w16sdtdh w16sdtfl w16du wp14">
   <w:body>
     <w:p>
       <w:pPr>
@@ -225,7 +225,6 @@
                 <w:szCs w:val="24"/>
               </w:rPr>
             </w:pPr>
-            <w:proofErr w:type="spellStart"/>
             <w:r>
               <w:rPr>
                 <w:rFonts w:ascii="Cambria" w:hAnsi="Cambria"/>
@@ -233,17 +232,7 @@
                 <w:sz w:val="24"/>
                 <w:szCs w:val="24"/>
               </w:rPr>
-              <w:t>Kode</w:t>
-            </w:r>
-            <w:proofErr w:type="spellEnd"/>
-            <w:r>
-              <w:rPr>
-                <w:rFonts w:ascii="Cambria" w:hAnsi="Cambria"/>
-                <w:b/>
-                <w:sz w:val="24"/>
-                <w:szCs w:val="24"/>
-              </w:rPr>
-              <w:t xml:space="preserve"> </w:t>
+              <w:t xml:space="preserve">Kode </w:t>
             </w:r>
             <w:proofErr w:type="spellStart"/>
             <w:r>
@@ -1156,34 +1145,16 @@
                 <w:sz w:val="22"/>
                 <w:szCs w:val="32"/>
               </w:rPr>
-              <w:t>{#</w:t>
-            </w:r>
-            <w:proofErr w:type="spellStart"/>
+              <w:t>{#dosen_pengembang_</w:t>
+            </w:r>
+            <w:proofErr w:type="gramStart"/>
             <w:r>
               <w:rPr>
                 <w:color w:val="000000" w:themeColor="text1"/>
                 <w:sz w:val="22"/>
                 <w:szCs w:val="32"/>
               </w:rPr>
-              <w:t>dosen_pengembang_</w:t>
-            </w:r>
-            <w:proofErr w:type="gramStart"/>
-            <w:r>
-              <w:rPr>
-                <w:color w:val="000000" w:themeColor="text1"/>
-                <w:sz w:val="22"/>
-                <w:szCs w:val="32"/>
-              </w:rPr>
-              <w:t>rps</w:t>
-            </w:r>
-            <w:proofErr w:type="spellEnd"/>
-            <w:r>
-              <w:rPr>
-                <w:color w:val="000000" w:themeColor="text1"/>
-                <w:sz w:val="22"/>
-                <w:szCs w:val="32"/>
-              </w:rPr>
-              <w:t>[</w:t>
+              <w:t>rps[</w:t>
             </w:r>
             <w:proofErr w:type="gramEnd"/>
             <w:r>
@@ -1538,7 +1509,7 @@
               </w:rPr>
               <w:t>{#</w:t>
             </w:r>
-            <w:proofErr w:type="spellStart"/>
+            <w:proofErr w:type="gramStart"/>
             <w:r>
               <w:rPr>
                 <w:rFonts w:ascii="Calibri" w:hAnsi="Calibri"/>
@@ -1546,9 +1517,9 @@
                 <w:szCs w:val="22"/>
                 <w:lang w:eastAsia="id-ID"/>
               </w:rPr>
-              <w:t>cplList</w:t>
-            </w:r>
-            <w:proofErr w:type="spellEnd"/>
+              <w:t>cplList}{</w:t>
+            </w:r>
+            <w:proofErr w:type="gramEnd"/>
             <w:r>
               <w:rPr>
                 <w:rFonts w:ascii="Calibri" w:hAnsi="Calibri"/>
@@ -1556,7 +1527,7 @@
                 <w:szCs w:val="22"/>
                 <w:lang w:eastAsia="id-ID"/>
               </w:rPr>
-              <w:t>} - {code}</w:t>
+              <w:t>code}</w:t>
             </w:r>
           </w:p>
         </w:tc>
@@ -1630,10 +1601,7 @@
               <w:t>}</w:t>
             </w:r>
           </w:p>
-          <w:p>
-            <w:bookmarkStart w:id="0" w:name="_GoBack"/>
-            <w:bookmarkEnd w:id="0"/>
-          </w:p>
+          <w:p/>
         </w:tc>
       </w:tr>
       <w:tr>
@@ -1782,27 +1750,7 @@
                 <w:szCs w:val="22"/>
                 <w:lang w:eastAsia="id-ID"/>
               </w:rPr>
-              <w:t>{#</w:t>
-            </w:r>
-            <w:proofErr w:type="spellStart"/>
-            <w:r>
-              <w:rPr>
-                <w:rFonts w:ascii="Calibri" w:hAnsi="Calibri"/>
-                <w:sz w:val="22"/>
-                <w:szCs w:val="22"/>
-                <w:lang w:eastAsia="id-ID"/>
-              </w:rPr>
-              <w:t>cpmk</w:t>
-            </w:r>
-            <w:proofErr w:type="spellEnd"/>
-            <w:r>
-              <w:rPr>
-                <w:rFonts w:ascii="Calibri" w:hAnsi="Calibri"/>
-                <w:sz w:val="22"/>
-                <w:szCs w:val="22"/>
-                <w:lang w:eastAsia="id-ID"/>
-              </w:rPr>
-              <w:t>} {</w:t>
+              <w:t>{#cpmk} {</w:t>
             </w:r>
             <w:proofErr w:type="spellStart"/>
             <w:r>
@@ -2110,9 +2058,9 @@
                 <w:szCs w:val="22"/>
                 <w:lang w:eastAsia="id-ID"/>
               </w:rPr>
-              <w:t>{#</w:t>
-            </w:r>
-            <w:proofErr w:type="spellStart"/>
+              <w:t>{#sub_</w:t>
+            </w:r>
+            <w:proofErr w:type="gramStart"/>
             <w:r>
               <w:rPr>
                 <w:rFonts w:ascii="Calibri" w:hAnsi="Calibri"/>
@@ -2121,9 +2069,9 @@
                 <w:szCs w:val="22"/>
                 <w:lang w:eastAsia="id-ID"/>
               </w:rPr>
-              <w:t>sub_</w:t>
-            </w:r>
-            <w:proofErr w:type="gramStart"/>
+              <w:t>cpmk}{</w:t>
+            </w:r>
+            <w:proofErr w:type="gramEnd"/>
             <w:r>
               <w:rPr>
                 <w:rFonts w:ascii="Calibri" w:hAnsi="Calibri"/>
@@ -2132,41 +2080,7 @@
                 <w:szCs w:val="22"/>
                 <w:lang w:eastAsia="id-ID"/>
               </w:rPr>
-              <w:t>cpmk</w:t>
-            </w:r>
-            <w:proofErr w:type="spellEnd"/>
-            <w:r>
-              <w:rPr>
-                <w:rFonts w:ascii="Calibri" w:hAnsi="Calibri"/>
-                <w:bCs/>
-                <w:sz w:val="22"/>
-                <w:szCs w:val="22"/>
-                <w:lang w:eastAsia="id-ID"/>
-              </w:rPr>
-              <w:t>}{</w:t>
-            </w:r>
-            <w:proofErr w:type="spellStart"/>
-            <w:proofErr w:type="gramEnd"/>
-            <w:r>
-              <w:rPr>
-                <w:rFonts w:ascii="Calibri" w:hAnsi="Calibri"/>
-                <w:bCs/>
-                <w:sz w:val="22"/>
-                <w:szCs w:val="22"/>
-                <w:lang w:eastAsia="id-ID"/>
-              </w:rPr>
-              <w:t>cpmkId</w:t>
-            </w:r>
-            <w:proofErr w:type="spellEnd"/>
-            <w:r>
-              <w:rPr>
-                <w:rFonts w:ascii="Calibri" w:hAnsi="Calibri"/>
-                <w:bCs/>
-                <w:sz w:val="22"/>
-                <w:szCs w:val="22"/>
-                <w:lang w:eastAsia="id-ID"/>
-              </w:rPr>
-              <w:t>}</w:t>
+              <w:t>cpmkId}</w:t>
             </w:r>
           </w:p>
         </w:tc>
@@ -2221,6 +2135,7 @@
               <w:t>subId</w:t>
             </w:r>
             <w:proofErr w:type="spellEnd"/>
+            <w:proofErr w:type="gramStart"/>
             <w:r>
               <w:rPr>
                 <w:rFonts w:ascii="Calibri" w:hAnsi="Calibri"/>
@@ -2228,7 +2143,17 @@
                 <w:sz w:val="22"/>
                 <w:szCs w:val="22"/>
               </w:rPr>
-              <w:t>} : {</w:t>
+              <w:t>} :</w:t>
+            </w:r>
+            <w:proofErr w:type="gramEnd"/>
+            <w:r>
+              <w:rPr>
+                <w:rFonts w:ascii="Calibri" w:hAnsi="Calibri"/>
+                <w:bCs/>
+                <w:sz w:val="22"/>
+                <w:szCs w:val="22"/>
+              </w:rPr>
+              <w:t xml:space="preserve"> {</w:t>
             </w:r>
             <w:proofErr w:type="spellStart"/>
             <w:r>
@@ -2547,7 +2472,6 @@
                       <w:lang w:eastAsia="id-ID"/>
                     </w:rPr>
                   </w:pPr>
-                  <w:proofErr w:type="spellStart"/>
                   <w:r>
                     <w:rPr>
                       <w:rFonts w:ascii="Calibri" w:hAnsi="Calibri"/>
@@ -2556,18 +2480,7 @@
                       <w:szCs w:val="22"/>
                       <w:lang w:eastAsia="id-ID"/>
                     </w:rPr>
-                    <w:t>Metode</w:t>
-                  </w:r>
-                  <w:proofErr w:type="spellEnd"/>
-                  <w:r>
-                    <w:rPr>
-                      <w:rFonts w:ascii="Calibri" w:hAnsi="Calibri"/>
-                      <w:b/>
-                      <w:sz w:val="22"/>
-                      <w:szCs w:val="22"/>
-                      <w:lang w:eastAsia="id-ID"/>
-                    </w:rPr>
-                    <w:t xml:space="preserve"> </w:t>
+                    <w:t xml:space="preserve">Metode </w:t>
                   </w:r>
                   <w:proofErr w:type="spellStart"/>
                   <w:r>
@@ -3115,17 +3028,7 @@
                       <w:szCs w:val="22"/>
                       <w:lang w:eastAsia="id-ID"/>
                     </w:rPr>
-                    <w:t>{#</w:t>
-                  </w:r>
-                  <w:proofErr w:type="spellStart"/>
-                  <w:r>
-                    <w:rPr>
-                      <w:rFonts w:ascii="Calibri" w:hAnsi="Calibri"/>
-                      <w:sz w:val="22"/>
-                      <w:szCs w:val="22"/>
-                      <w:lang w:eastAsia="id-ID"/>
-                    </w:rPr>
-                    <w:t>sub_</w:t>
+                    <w:t>{#sub_</w:t>
                   </w:r>
                   <w:proofErr w:type="gramStart"/>
                   <w:r>
@@ -3135,19 +3038,8 @@
                       <w:szCs w:val="22"/>
                       <w:lang w:eastAsia="id-ID"/>
                     </w:rPr>
-                    <w:t>cpmk</w:t>
+                    <w:t>cpmk}{</w:t>
                   </w:r>
-                  <w:proofErr w:type="spellEnd"/>
-                  <w:r>
-                    <w:rPr>
-                      <w:rFonts w:ascii="Calibri" w:hAnsi="Calibri"/>
-                      <w:sz w:val="22"/>
-                      <w:szCs w:val="22"/>
-                      <w:lang w:eastAsia="id-ID"/>
-                    </w:rPr>
-                    <w:t>}{</w:t>
-                  </w:r>
-                  <w:proofErr w:type="spellStart"/>
                   <w:proofErr w:type="gramEnd"/>
                   <w:r>
                     <w:rPr>
@@ -3156,17 +3048,7 @@
                       <w:szCs w:val="22"/>
                       <w:lang w:eastAsia="id-ID"/>
                     </w:rPr>
-                    <w:t>cpl</w:t>
-                  </w:r>
-                  <w:proofErr w:type="spellEnd"/>
-                  <w:r>
-                    <w:rPr>
-                      <w:rFonts w:ascii="Calibri" w:hAnsi="Calibri"/>
-                      <w:sz w:val="22"/>
-                      <w:szCs w:val="22"/>
-                      <w:lang w:eastAsia="id-ID"/>
-                    </w:rPr>
-                    <w:t>}</w:t>
+                    <w:t>cpl}</w:t>
                   </w:r>
                 </w:p>
               </w:tc>
@@ -3967,45 +3849,14 @@
                 <w:szCs w:val="22"/>
               </w:rPr>
             </w:pPr>
-            <w:proofErr w:type="spellStart"/>
-            <w:r>
-              <w:rPr>
-                <w:rFonts w:ascii="Calibri" w:hAnsi="Calibri"/>
-                <w:b/>
-                <w:sz w:val="22"/>
-                <w:szCs w:val="22"/>
-              </w:rPr>
-              <w:t>Materi</w:t>
-            </w:r>
-            <w:proofErr w:type="spellEnd"/>
-            <w:r>
-              <w:rPr>
-                <w:rFonts w:ascii="Calibri" w:hAnsi="Calibri"/>
-                <w:b/>
-                <w:sz w:val="22"/>
-                <w:szCs w:val="22"/>
-              </w:rPr>
-              <w:t xml:space="preserve"> Kajian / </w:t>
-            </w:r>
-            <w:proofErr w:type="spellStart"/>
-            <w:r>
-              <w:rPr>
-                <w:rFonts w:ascii="Calibri" w:hAnsi="Calibri"/>
-                <w:b/>
-                <w:sz w:val="22"/>
-                <w:szCs w:val="22"/>
-              </w:rPr>
-              <w:t>Materi</w:t>
-            </w:r>
-            <w:proofErr w:type="spellEnd"/>
-            <w:r>
-              <w:rPr>
-                <w:rFonts w:ascii="Calibri" w:hAnsi="Calibri"/>
-                <w:b/>
-                <w:sz w:val="22"/>
-                <w:szCs w:val="22"/>
-              </w:rPr>
-              <w:t xml:space="preserve"> </w:t>
+            <w:r>
+              <w:rPr>
+                <w:rFonts w:ascii="Calibri" w:hAnsi="Calibri"/>
+                <w:b/>
+                <w:sz w:val="22"/>
+                <w:szCs w:val="22"/>
+              </w:rPr>
+              <w:t xml:space="preserve">Materi Kajian / Materi </w:t>
             </w:r>
             <w:proofErr w:type="spellStart"/>
             <w:r>
@@ -4198,19 +4049,11 @@
           </w:tcPr>
           <w:p>
             <w:r>
-              <w:t>{#</w:t>
-            </w:r>
-            <w:proofErr w:type="spellStart"/>
-            <w:r>
-              <w:t>pustaka_</w:t>
+              <w:t>{#pustaka_</w:t>
             </w:r>
             <w:proofErr w:type="gramStart"/>
             <w:r>
-              <w:t>utama</w:t>
-            </w:r>
-            <w:proofErr w:type="spellEnd"/>
-            <w:r>
-              <w:t>[</w:t>
+              <w:t>utama[</w:t>
             </w:r>
             <w:proofErr w:type="gramEnd"/>
             <w:r>
@@ -4370,19 +4213,11 @@
           </w:tcPr>
           <w:p>
             <w:r>
-              <w:t>{#</w:t>
-            </w:r>
-            <w:proofErr w:type="spellStart"/>
-            <w:r>
-              <w:t>pustaka_</w:t>
+              <w:t>{#pustaka_</w:t>
             </w:r>
             <w:proofErr w:type="gramStart"/>
             <w:r>
-              <w:t>pendukung</w:t>
-            </w:r>
-            <w:proofErr w:type="spellEnd"/>
-            <w:r>
-              <w:t>[</w:t>
+              <w:t>pendukung[</w:t>
             </w:r>
             <w:proofErr w:type="gramEnd"/>
             <w:r>
@@ -4433,25 +4268,14 @@
                 <w:szCs w:val="22"/>
               </w:rPr>
             </w:pPr>
-            <w:proofErr w:type="spellStart"/>
-            <w:r>
-              <w:rPr>
-                <w:rFonts w:ascii="Calibri" w:hAnsi="Calibri"/>
-                <w:b/>
-                <w:sz w:val="22"/>
-                <w:szCs w:val="22"/>
-              </w:rPr>
-              <w:t>Dosen</w:t>
-            </w:r>
-            <w:proofErr w:type="spellEnd"/>
-            <w:r>
-              <w:rPr>
-                <w:rFonts w:ascii="Calibri" w:hAnsi="Calibri"/>
-                <w:b/>
-                <w:sz w:val="22"/>
-                <w:szCs w:val="22"/>
-              </w:rPr>
-              <w:t xml:space="preserve"> </w:t>
+            <w:r>
+              <w:rPr>
+                <w:rFonts w:ascii="Calibri" w:hAnsi="Calibri"/>
+                <w:b/>
+                <w:sz w:val="22"/>
+                <w:szCs w:val="22"/>
+              </w:rPr>
+              <w:t xml:space="preserve">Dosen </w:t>
             </w:r>
             <w:proofErr w:type="spellStart"/>
             <w:r>
@@ -4690,7 +4514,6 @@
                 <w:lang w:val="id-ID"/>
               </w:rPr>
             </w:pPr>
-            <w:proofErr w:type="spellStart"/>
             <w:r>
               <w:rPr>
                 <w:rFonts w:ascii="Calibri" w:hAnsi="Calibri"/>
@@ -4702,7 +4525,6 @@
               </w:rPr>
               <w:t>Pekan</w:t>
             </w:r>
-            <w:proofErr w:type="spellEnd"/>
             <w:r>
               <w:rPr>
                 <w:rFonts w:ascii="Calibri" w:hAnsi="Calibri"/>
@@ -5766,53 +5588,25 @@
                 <w:szCs w:val="24"/>
                 <w:lang w:eastAsia="id-ID"/>
               </w:rPr>
-              <w:t>{#</w:t>
-            </w:r>
-            <w:proofErr w:type="spellStart"/>
+              <w:t>{#sub_</w:t>
+            </w:r>
+            <w:proofErr w:type="gramStart"/>
             <w:r>
               <w:rPr>
                 <w:sz w:val="24"/>
                 <w:szCs w:val="24"/>
                 <w:lang w:eastAsia="id-ID"/>
               </w:rPr>
-              <w:t>sub_</w:t>
-            </w:r>
-            <w:proofErr w:type="gramStart"/>
+              <w:t>cpmk}{</w:t>
+            </w:r>
+            <w:proofErr w:type="gramEnd"/>
             <w:r>
               <w:rPr>
                 <w:sz w:val="24"/>
                 <w:szCs w:val="24"/>
                 <w:lang w:eastAsia="id-ID"/>
               </w:rPr>
-              <w:t>cpmk</w:t>
-            </w:r>
-            <w:proofErr w:type="spellEnd"/>
-            <w:r>
-              <w:rPr>
-                <w:sz w:val="24"/>
-                <w:szCs w:val="24"/>
-                <w:lang w:eastAsia="id-ID"/>
-              </w:rPr>
-              <w:t>}{</w:t>
-            </w:r>
-            <w:proofErr w:type="spellStart"/>
-            <w:proofErr w:type="gramEnd"/>
-            <w:r>
-              <w:rPr>
-                <w:sz w:val="24"/>
-                <w:szCs w:val="24"/>
-                <w:lang w:eastAsia="id-ID"/>
-              </w:rPr>
-              <w:t>pekan_awal</w:t>
-            </w:r>
-            <w:proofErr w:type="spellEnd"/>
-            <w:r>
-              <w:rPr>
-                <w:sz w:val="24"/>
-                <w:szCs w:val="24"/>
-                <w:lang w:eastAsia="id-ID"/>
-              </w:rPr>
-              <w:t>} - {</w:t>
+              <w:t>pekan_awal} - {</w:t>
             </w:r>
             <w:proofErr w:type="spellStart"/>
             <w:r>
@@ -6210,7 +6004,7 @@
 </file>
 
 <file path=word/endnotes.xml><?xml version="1.0" encoding="utf-8"?>
-<w:endnotes xmlns:wpc="http://schemas.microsoft.com/office/word/2010/wordprocessingCanvas" xmlns:cx="http://schemas.microsoft.com/office/drawing/2014/chartex" xmlns:cx1="http://schemas.microsoft.com/office/drawing/2015/9/8/chartex" xmlns:cx2="http://schemas.microsoft.com/office/drawing/2015/10/21/chartex" xmlns:cx3="http://schemas.microsoft.com/office/drawing/2016/5/9/chartex" xmlns:cx4="http://schemas.microsoft.com/office/drawing/2016/5/10/chartex" xmlns:cx5="http://schemas.microsoft.com/office/drawing/2016/5/11/chartex" xmlns:cx6="http://schemas.microsoft.com/office/drawing/2016/5/12/chartex" xmlns:cx7="http://schemas.microsoft.com/office/drawing/2016/5/13/chartex" xmlns:cx8="http://schemas.microsoft.com/office/drawing/2016/5/14/chartex" xmlns:mc="http://schemas.openxmlformats.org/markup-compatibility/2006" xmlns:aink="http://schemas.microsoft.com/office/drawing/2016/ink" xmlns:am3d="http://schemas.microsoft.com/office/drawing/2017/model3d" xmlns:o="urn:schemas-microsoft-com:office:office" xmlns:r="http://schemas.openxmlformats.org/officeDocument/2006/relationships" xmlns:m="http://schemas.openxmlformats.org/officeDocument/2006/math" xmlns:v="urn:schemas-microsoft-com:vml" xmlns:wp14="http://schemas.microsoft.com/office/word/2010/wordprocessingDrawing" xmlns:wp="http://schemas.openxmlformats.org/drawingml/2006/wordprocessingDrawing" xmlns:w10="urn:schemas-microsoft-com:office:word" xmlns:w="http://schemas.openxmlformats.org/wordprocessingml/2006/main" xmlns:w14="http://schemas.microsoft.com/office/word/2010/wordml" xmlns:w15="http://schemas.microsoft.com/office/word/2012/wordml" xmlns:w16cex="http://schemas.microsoft.com/office/word/2018/wordml/cex" xmlns:w16cid="http://schemas.microsoft.com/office/word/2016/wordml/cid" xmlns:w16="http://schemas.microsoft.com/office/word/2018/wordml" xmlns:w16se="http://schemas.microsoft.com/office/word/2015/wordml/symex" xmlns:wpg="http://schemas.microsoft.com/office/word/2010/wordprocessingGroup" xmlns:wpi="http://schemas.microsoft.com/office/word/2010/wordprocessingInk" xmlns:wne="http://schemas.microsoft.com/office/word/2006/wordml" xmlns:wps="http://schemas.microsoft.com/office/word/2010/wordprocessingShape" mc:Ignorable="w14 w15 w16se w16cid w16 w16cex wp14">
+<w:endnotes xmlns:wpc="http://schemas.microsoft.com/office/word/2010/wordprocessingCanvas" xmlns:cx="http://schemas.microsoft.com/office/drawing/2014/chartex" xmlns:cx1="http://schemas.microsoft.com/office/drawing/2015/9/8/chartex" xmlns:cx2="http://schemas.microsoft.com/office/drawing/2015/10/21/chartex" xmlns:cx3="http://schemas.microsoft.com/office/drawing/2016/5/9/chartex" xmlns:cx4="http://schemas.microsoft.com/office/drawing/2016/5/10/chartex" xmlns:cx5="http://schemas.microsoft.com/office/drawing/2016/5/11/chartex" xmlns:cx6="http://schemas.microsoft.com/office/drawing/2016/5/12/chartex" xmlns:cx7="http://schemas.microsoft.com/office/drawing/2016/5/13/chartex" xmlns:cx8="http://schemas.microsoft.com/office/drawing/2016/5/14/chartex" xmlns:mc="http://schemas.openxmlformats.org/markup-compatibility/2006" xmlns:aink="http://schemas.microsoft.com/office/drawing/2016/ink" xmlns:am3d="http://schemas.microsoft.com/office/drawing/2017/model3d" xmlns:o="urn:schemas-microsoft-com:office:office" xmlns:oel="http://schemas.microsoft.com/office/2019/extlst" xmlns:r="http://schemas.openxmlformats.org/officeDocument/2006/relationships" xmlns:m="http://schemas.openxmlformats.org/officeDocument/2006/math" xmlns:v="urn:schemas-microsoft-com:vml" xmlns:wp14="http://schemas.microsoft.com/office/word/2010/wordprocessingDrawing" xmlns:wp="http://schemas.openxmlformats.org/drawingml/2006/wordprocessingDrawing" xmlns:w10="urn:schemas-microsoft-com:office:word" xmlns:w="http://schemas.openxmlformats.org/wordprocessingml/2006/main" xmlns:w14="http://schemas.microsoft.com/office/word/2010/wordml" xmlns:w15="http://schemas.microsoft.com/office/word/2012/wordml" xmlns:w16cex="http://schemas.microsoft.com/office/word/2018/wordml/cex" xmlns:w16cid="http://schemas.microsoft.com/office/word/2016/wordml/cid" xmlns:w16="http://schemas.microsoft.com/office/word/2018/wordml" xmlns:w16du="http://schemas.microsoft.com/office/word/2023/wordml/word16du" xmlns:w16sdtdh="http://schemas.microsoft.com/office/word/2020/wordml/sdtdatahash" xmlns:w16sdtfl="http://schemas.microsoft.com/office/word/2024/wordml/sdtformatlock" xmlns:w16se="http://schemas.microsoft.com/office/word/2015/wordml/symex" xmlns:wpg="http://schemas.microsoft.com/office/word/2010/wordprocessingGroup" xmlns:wpi="http://schemas.microsoft.com/office/word/2010/wordprocessingInk" xmlns:wne="http://schemas.microsoft.com/office/word/2006/wordml" xmlns:wps="http://schemas.microsoft.com/office/word/2010/wordprocessingShape" mc:Ignorable="w14 w15 w16se w16cid w16 w16cex w16sdtdh w16sdtfl w16du wp14">
   <w:endnote w:type="separator" w:id="-1">
     <w:p>
       <w:r>
@@ -6229,7 +6023,7 @@
 </file>
 
 <file path=word/footer1.xml><?xml version="1.0" encoding="utf-8"?>
-<w:ftr xmlns:wpc="http://schemas.microsoft.com/office/word/2010/wordprocessingCanvas" xmlns:cx="http://schemas.microsoft.com/office/drawing/2014/chartex" xmlns:cx1="http://schemas.microsoft.com/office/drawing/2015/9/8/chartex" xmlns:cx2="http://schemas.microsoft.com/office/drawing/2015/10/21/chartex" xmlns:cx3="http://schemas.microsoft.com/office/drawing/2016/5/9/chartex" xmlns:cx4="http://schemas.microsoft.com/office/drawing/2016/5/10/chartex" xmlns:cx5="http://schemas.microsoft.com/office/drawing/2016/5/11/chartex" xmlns:cx6="http://schemas.microsoft.com/office/drawing/2016/5/12/chartex" xmlns:cx7="http://schemas.microsoft.com/office/drawing/2016/5/13/chartex" xmlns:cx8="http://schemas.microsoft.com/office/drawing/2016/5/14/chartex" xmlns:mc="http://schemas.openxmlformats.org/markup-compatibility/2006" xmlns:aink="http://schemas.microsoft.com/office/drawing/2016/ink" xmlns:am3d="http://schemas.microsoft.com/office/drawing/2017/model3d" xmlns:o="urn:schemas-microsoft-com:office:office" xmlns:r="http://schemas.openxmlformats.org/officeDocument/2006/relationships" xmlns:m="http://schemas.openxmlformats.org/officeDocument/2006/math" xmlns:v="urn:schemas-microsoft-com:vml" xmlns:wp14="http://schemas.microsoft.com/office/word/2010/wordprocessingDrawing" xmlns:wp="http://schemas.openxmlformats.org/drawingml/2006/wordprocessingDrawing" xmlns:w10="urn:schemas-microsoft-com:office:word" xmlns:w="http://schemas.openxmlformats.org/wordprocessingml/2006/main" xmlns:w14="http://schemas.microsoft.com/office/word/2010/wordml" xmlns:w15="http://schemas.microsoft.com/office/word/2012/wordml" xmlns:w16cex="http://schemas.microsoft.com/office/word/2018/wordml/cex" xmlns:w16cid="http://schemas.microsoft.com/office/word/2016/wordml/cid" xmlns:w16="http://schemas.microsoft.com/office/word/2018/wordml" xmlns:w16se="http://schemas.microsoft.com/office/word/2015/wordml/symex" xmlns:wpg="http://schemas.microsoft.com/office/word/2010/wordprocessingGroup" xmlns:wpi="http://schemas.microsoft.com/office/word/2010/wordprocessingInk" xmlns:wne="http://schemas.microsoft.com/office/word/2006/wordml" xmlns:wps="http://schemas.microsoft.com/office/word/2010/wordprocessingShape" mc:Ignorable="w14 w15 w16se w16cid w16 w16cex wp14">
+<w:ftr xmlns:wpc="http://schemas.microsoft.com/office/word/2010/wordprocessingCanvas" xmlns:cx="http://schemas.microsoft.com/office/drawing/2014/chartex" xmlns:cx1="http://schemas.microsoft.com/office/drawing/2015/9/8/chartex" xmlns:cx2="http://schemas.microsoft.com/office/drawing/2015/10/21/chartex" xmlns:cx3="http://schemas.microsoft.com/office/drawing/2016/5/9/chartex" xmlns:cx4="http://schemas.microsoft.com/office/drawing/2016/5/10/chartex" xmlns:cx5="http://schemas.microsoft.com/office/drawing/2016/5/11/chartex" xmlns:cx6="http://schemas.microsoft.com/office/drawing/2016/5/12/chartex" xmlns:cx7="http://schemas.microsoft.com/office/drawing/2016/5/13/chartex" xmlns:cx8="http://schemas.microsoft.com/office/drawing/2016/5/14/chartex" xmlns:mc="http://schemas.openxmlformats.org/markup-compatibility/2006" xmlns:aink="http://schemas.microsoft.com/office/drawing/2016/ink" xmlns:am3d="http://schemas.microsoft.com/office/drawing/2017/model3d" xmlns:o="urn:schemas-microsoft-com:office:office" xmlns:oel="http://schemas.microsoft.com/office/2019/extlst" xmlns:r="http://schemas.openxmlformats.org/officeDocument/2006/relationships" xmlns:m="http://schemas.openxmlformats.org/officeDocument/2006/math" xmlns:v="urn:schemas-microsoft-com:vml" xmlns:wp14="http://schemas.microsoft.com/office/word/2010/wordprocessingDrawing" xmlns:wp="http://schemas.openxmlformats.org/drawingml/2006/wordprocessingDrawing" xmlns:w10="urn:schemas-microsoft-com:office:word" xmlns:w="http://schemas.openxmlformats.org/wordprocessingml/2006/main" xmlns:w14="http://schemas.microsoft.com/office/word/2010/wordml" xmlns:w15="http://schemas.microsoft.com/office/word/2012/wordml" xmlns:w16cex="http://schemas.microsoft.com/office/word/2018/wordml/cex" xmlns:w16cid="http://schemas.microsoft.com/office/word/2016/wordml/cid" xmlns:w16="http://schemas.microsoft.com/office/word/2018/wordml" xmlns:w16du="http://schemas.microsoft.com/office/word/2023/wordml/word16du" xmlns:w16sdtdh="http://schemas.microsoft.com/office/word/2020/wordml/sdtdatahash" xmlns:w16sdtfl="http://schemas.microsoft.com/office/word/2024/wordml/sdtformatlock" xmlns:w16se="http://schemas.microsoft.com/office/word/2015/wordml/symex" xmlns:wpg="http://schemas.microsoft.com/office/word/2010/wordprocessingGroup" xmlns:wpi="http://schemas.microsoft.com/office/word/2010/wordprocessingInk" xmlns:wne="http://schemas.microsoft.com/office/word/2006/wordml" xmlns:wps="http://schemas.microsoft.com/office/word/2010/wordprocessingShape" mc:Ignorable="w14 w15 w16se w16cid w16 w16cex w16sdtdh w16sdtfl w16du wp14">
   <w:p>
     <w:pPr>
       <w:pStyle w:val="Footer"/>
@@ -6239,7 +6033,7 @@
 </file>
 
 <file path=word/footer2.xml><?xml version="1.0" encoding="utf-8"?>
-<w:ftr xmlns:wpc="http://schemas.microsoft.com/office/word/2010/wordprocessingCanvas" xmlns:cx="http://schemas.microsoft.com/office/drawing/2014/chartex" xmlns:cx1="http://schemas.microsoft.com/office/drawing/2015/9/8/chartex" xmlns:cx2="http://schemas.microsoft.com/office/drawing/2015/10/21/chartex" xmlns:cx3="http://schemas.microsoft.com/office/drawing/2016/5/9/chartex" xmlns:cx4="http://schemas.microsoft.com/office/drawing/2016/5/10/chartex" xmlns:cx5="http://schemas.microsoft.com/office/drawing/2016/5/11/chartex" xmlns:cx6="http://schemas.microsoft.com/office/drawing/2016/5/12/chartex" xmlns:cx7="http://schemas.microsoft.com/office/drawing/2016/5/13/chartex" xmlns:cx8="http://schemas.microsoft.com/office/drawing/2016/5/14/chartex" xmlns:mc="http://schemas.openxmlformats.org/markup-compatibility/2006" xmlns:aink="http://schemas.microsoft.com/office/drawing/2016/ink" xmlns:am3d="http://schemas.microsoft.com/office/drawing/2017/model3d" xmlns:o="urn:schemas-microsoft-com:office:office" xmlns:r="http://schemas.openxmlformats.org/officeDocument/2006/relationships" xmlns:m="http://schemas.openxmlformats.org/officeDocument/2006/math" xmlns:v="urn:schemas-microsoft-com:vml" xmlns:wp14="http://schemas.microsoft.com/office/word/2010/wordprocessingDrawing" xmlns:wp="http://schemas.openxmlformats.org/drawingml/2006/wordprocessingDrawing" xmlns:w10="urn:schemas-microsoft-com:office:word" xmlns:w="http://schemas.openxmlformats.org/wordprocessingml/2006/main" xmlns:w14="http://schemas.microsoft.com/office/word/2010/wordml" xmlns:w15="http://schemas.microsoft.com/office/word/2012/wordml" xmlns:w16cex="http://schemas.microsoft.com/office/word/2018/wordml/cex" xmlns:w16cid="http://schemas.microsoft.com/office/word/2016/wordml/cid" xmlns:w16="http://schemas.microsoft.com/office/word/2018/wordml" xmlns:w16se="http://schemas.microsoft.com/office/word/2015/wordml/symex" xmlns:wpg="http://schemas.microsoft.com/office/word/2010/wordprocessingGroup" xmlns:wpi="http://schemas.microsoft.com/office/word/2010/wordprocessingInk" xmlns:wne="http://schemas.microsoft.com/office/word/2006/wordml" xmlns:wps="http://schemas.microsoft.com/office/word/2010/wordprocessingShape" mc:Ignorable="w14 w15 w16se w16cid w16 w16cex wp14">
+<w:ftr xmlns:wpc="http://schemas.microsoft.com/office/word/2010/wordprocessingCanvas" xmlns:cx="http://schemas.microsoft.com/office/drawing/2014/chartex" xmlns:cx1="http://schemas.microsoft.com/office/drawing/2015/9/8/chartex" xmlns:cx2="http://schemas.microsoft.com/office/drawing/2015/10/21/chartex" xmlns:cx3="http://schemas.microsoft.com/office/drawing/2016/5/9/chartex" xmlns:cx4="http://schemas.microsoft.com/office/drawing/2016/5/10/chartex" xmlns:cx5="http://schemas.microsoft.com/office/drawing/2016/5/11/chartex" xmlns:cx6="http://schemas.microsoft.com/office/drawing/2016/5/12/chartex" xmlns:cx7="http://schemas.microsoft.com/office/drawing/2016/5/13/chartex" xmlns:cx8="http://schemas.microsoft.com/office/drawing/2016/5/14/chartex" xmlns:mc="http://schemas.openxmlformats.org/markup-compatibility/2006" xmlns:aink="http://schemas.microsoft.com/office/drawing/2016/ink" xmlns:am3d="http://schemas.microsoft.com/office/drawing/2017/model3d" xmlns:o="urn:schemas-microsoft-com:office:office" xmlns:oel="http://schemas.microsoft.com/office/2019/extlst" xmlns:r="http://schemas.openxmlformats.org/officeDocument/2006/relationships" xmlns:m="http://schemas.openxmlformats.org/officeDocument/2006/math" xmlns:v="urn:schemas-microsoft-com:vml" xmlns:wp14="http://schemas.microsoft.com/office/word/2010/wordprocessingDrawing" xmlns:wp="http://schemas.openxmlformats.org/drawingml/2006/wordprocessingDrawing" xmlns:w10="urn:schemas-microsoft-com:office:word" xmlns:w="http://schemas.openxmlformats.org/wordprocessingml/2006/main" xmlns:w14="http://schemas.microsoft.com/office/word/2010/wordml" xmlns:w15="http://schemas.microsoft.com/office/word/2012/wordml" xmlns:w16cex="http://schemas.microsoft.com/office/word/2018/wordml/cex" xmlns:w16cid="http://schemas.microsoft.com/office/word/2016/wordml/cid" xmlns:w16="http://schemas.microsoft.com/office/word/2018/wordml" xmlns:w16du="http://schemas.microsoft.com/office/word/2023/wordml/word16du" xmlns:w16sdtdh="http://schemas.microsoft.com/office/word/2020/wordml/sdtdatahash" xmlns:w16sdtfl="http://schemas.microsoft.com/office/word/2024/wordml/sdtformatlock" xmlns:w16se="http://schemas.microsoft.com/office/word/2015/wordml/symex" xmlns:wpg="http://schemas.microsoft.com/office/word/2010/wordprocessingGroup" xmlns:wpi="http://schemas.microsoft.com/office/word/2010/wordprocessingInk" xmlns:wne="http://schemas.microsoft.com/office/word/2006/wordml" xmlns:wps="http://schemas.microsoft.com/office/word/2010/wordprocessingShape" mc:Ignorable="w14 w15 w16se w16cid w16 w16cex w16sdtdh w16sdtfl w16du wp14">
   <w:p>
     <w:pPr>
       <w:pStyle w:val="Footer"/>
@@ -6288,7 +6082,7 @@
 </file>
 
 <file path=word/footer3.xml><?xml version="1.0" encoding="utf-8"?>
-<w:ftr xmlns:wpc="http://schemas.microsoft.com/office/word/2010/wordprocessingCanvas" xmlns:cx="http://schemas.microsoft.com/office/drawing/2014/chartex" xmlns:cx1="http://schemas.microsoft.com/office/drawing/2015/9/8/chartex" xmlns:cx2="http://schemas.microsoft.com/office/drawing/2015/10/21/chartex" xmlns:cx3="http://schemas.microsoft.com/office/drawing/2016/5/9/chartex" xmlns:cx4="http://schemas.microsoft.com/office/drawing/2016/5/10/chartex" xmlns:cx5="http://schemas.microsoft.com/office/drawing/2016/5/11/chartex" xmlns:cx6="http://schemas.microsoft.com/office/drawing/2016/5/12/chartex" xmlns:cx7="http://schemas.microsoft.com/office/drawing/2016/5/13/chartex" xmlns:cx8="http://schemas.microsoft.com/office/drawing/2016/5/14/chartex" xmlns:mc="http://schemas.openxmlformats.org/markup-compatibility/2006" xmlns:aink="http://schemas.microsoft.com/office/drawing/2016/ink" xmlns:am3d="http://schemas.microsoft.com/office/drawing/2017/model3d" xmlns:o="urn:schemas-microsoft-com:office:office" xmlns:r="http://schemas.openxmlformats.org/officeDocument/2006/relationships" xmlns:m="http://schemas.openxmlformats.org/officeDocument/2006/math" xmlns:v="urn:schemas-microsoft-com:vml" xmlns:wp14="http://schemas.microsoft.com/office/word/2010/wordprocessingDrawing" xmlns:wp="http://schemas.openxmlformats.org/drawingml/2006/wordprocessingDrawing" xmlns:w10="urn:schemas-microsoft-com:office:word" xmlns:w="http://schemas.openxmlformats.org/wordprocessingml/2006/main" xmlns:w14="http://schemas.microsoft.com/office/word/2010/wordml" xmlns:w15="http://schemas.microsoft.com/office/word/2012/wordml" xmlns:w16cex="http://schemas.microsoft.com/office/word/2018/wordml/cex" xmlns:w16cid="http://schemas.microsoft.com/office/word/2016/wordml/cid" xmlns:w16="http://schemas.microsoft.com/office/word/2018/wordml" xmlns:w16se="http://schemas.microsoft.com/office/word/2015/wordml/symex" xmlns:wpg="http://schemas.microsoft.com/office/word/2010/wordprocessingGroup" xmlns:wpi="http://schemas.microsoft.com/office/word/2010/wordprocessingInk" xmlns:wne="http://schemas.microsoft.com/office/word/2006/wordml" xmlns:wps="http://schemas.microsoft.com/office/word/2010/wordprocessingShape" mc:Ignorable="w14 w15 w16se w16cid w16 w16cex wp14">
+<w:ftr xmlns:wpc="http://schemas.microsoft.com/office/word/2010/wordprocessingCanvas" xmlns:cx="http://schemas.microsoft.com/office/drawing/2014/chartex" xmlns:cx1="http://schemas.microsoft.com/office/drawing/2015/9/8/chartex" xmlns:cx2="http://schemas.microsoft.com/office/drawing/2015/10/21/chartex" xmlns:cx3="http://schemas.microsoft.com/office/drawing/2016/5/9/chartex" xmlns:cx4="http://schemas.microsoft.com/office/drawing/2016/5/10/chartex" xmlns:cx5="http://schemas.microsoft.com/office/drawing/2016/5/11/chartex" xmlns:cx6="http://schemas.microsoft.com/office/drawing/2016/5/12/chartex" xmlns:cx7="http://schemas.microsoft.com/office/drawing/2016/5/13/chartex" xmlns:cx8="http://schemas.microsoft.com/office/drawing/2016/5/14/chartex" xmlns:mc="http://schemas.openxmlformats.org/markup-compatibility/2006" xmlns:aink="http://schemas.microsoft.com/office/drawing/2016/ink" xmlns:am3d="http://schemas.microsoft.com/office/drawing/2017/model3d" xmlns:o="urn:schemas-microsoft-com:office:office" xmlns:oel="http://schemas.microsoft.com/office/2019/extlst" xmlns:r="http://schemas.openxmlformats.org/officeDocument/2006/relationships" xmlns:m="http://schemas.openxmlformats.org/officeDocument/2006/math" xmlns:v="urn:schemas-microsoft-com:vml" xmlns:wp14="http://schemas.microsoft.com/office/word/2010/wordprocessingDrawing" xmlns:wp="http://schemas.openxmlformats.org/drawingml/2006/wordprocessingDrawing" xmlns:w10="urn:schemas-microsoft-com:office:word" xmlns:w="http://schemas.openxmlformats.org/wordprocessingml/2006/main" xmlns:w14="http://schemas.microsoft.com/office/word/2010/wordml" xmlns:w15="http://schemas.microsoft.com/office/word/2012/wordml" xmlns:w16cex="http://schemas.microsoft.com/office/word/2018/wordml/cex" xmlns:w16cid="http://schemas.microsoft.com/office/word/2016/wordml/cid" xmlns:w16="http://schemas.microsoft.com/office/word/2018/wordml" xmlns:w16du="http://schemas.microsoft.com/office/word/2023/wordml/word16du" xmlns:w16sdtdh="http://schemas.microsoft.com/office/word/2020/wordml/sdtdatahash" xmlns:w16sdtfl="http://schemas.microsoft.com/office/word/2024/wordml/sdtformatlock" xmlns:w16se="http://schemas.microsoft.com/office/word/2015/wordml/symex" xmlns:wpg="http://schemas.microsoft.com/office/word/2010/wordprocessingGroup" xmlns:wpi="http://schemas.microsoft.com/office/word/2010/wordprocessingInk" xmlns:wne="http://schemas.microsoft.com/office/word/2006/wordml" xmlns:wps="http://schemas.microsoft.com/office/word/2010/wordprocessingShape" mc:Ignorable="w14 w15 w16se w16cid w16 w16cex w16sdtdh w16sdtfl w16du wp14">
   <w:p>
     <w:pPr>
       <w:pStyle w:val="Footer"/>
@@ -6298,7 +6092,7 @@
 </file>
 
 <file path=word/footnotes.xml><?xml version="1.0" encoding="utf-8"?>
-<w:footnotes xmlns:wpc="http://schemas.microsoft.com/office/word/2010/wordprocessingCanvas" xmlns:cx="http://schemas.microsoft.com/office/drawing/2014/chartex" xmlns:cx1="http://schemas.microsoft.com/office/drawing/2015/9/8/chartex" xmlns:cx2="http://schemas.microsoft.com/office/drawing/2015/10/21/chartex" xmlns:cx3="http://schemas.microsoft.com/office/drawing/2016/5/9/chartex" xmlns:cx4="http://schemas.microsoft.com/office/drawing/2016/5/10/chartex" xmlns:cx5="http://schemas.microsoft.com/office/drawing/2016/5/11/chartex" xmlns:cx6="http://schemas.microsoft.com/office/drawing/2016/5/12/chartex" xmlns:cx7="http://schemas.microsoft.com/office/drawing/2016/5/13/chartex" xmlns:cx8="http://schemas.microsoft.com/office/drawing/2016/5/14/chartex" xmlns:mc="http://schemas.openxmlformats.org/markup-compatibility/2006" xmlns:aink="http://schemas.microsoft.com/office/drawing/2016/ink" xmlns:am3d="http://schemas.microsoft.com/office/drawing/2017/model3d" xmlns:o="urn:schemas-microsoft-com:office:office" xmlns:r="http://schemas.openxmlformats.org/officeDocument/2006/relationships" xmlns:m="http://schemas.openxmlformats.org/officeDocument/2006/math" xmlns:v="urn:schemas-microsoft-com:vml" xmlns:wp14="http://schemas.microsoft.com/office/word/2010/wordprocessingDrawing" xmlns:wp="http://schemas.openxmlformats.org/drawingml/2006/wordprocessingDrawing" xmlns:w10="urn:schemas-microsoft-com:office:word" xmlns:w="http://schemas.openxmlformats.org/wordprocessingml/2006/main" xmlns:w14="http://schemas.microsoft.com/office/word/2010/wordml" xmlns:w15="http://schemas.microsoft.com/office/word/2012/wordml" xmlns:w16cex="http://schemas.microsoft.com/office/word/2018/wordml/cex" xmlns:w16cid="http://schemas.microsoft.com/office/word/2016/wordml/cid" xmlns:w16="http://schemas.microsoft.com/office/word/2018/wordml" xmlns:w16se="http://schemas.microsoft.com/office/word/2015/wordml/symex" xmlns:wpg="http://schemas.microsoft.com/office/word/2010/wordprocessingGroup" xmlns:wpi="http://schemas.microsoft.com/office/word/2010/wordprocessingInk" xmlns:wne="http://schemas.microsoft.com/office/word/2006/wordml" xmlns:wps="http://schemas.microsoft.com/office/word/2010/wordprocessingShape" mc:Ignorable="w14 w15 w16se w16cid w16 w16cex wp14">
+<w:footnotes xmlns:wpc="http://schemas.microsoft.com/office/word/2010/wordprocessingCanvas" xmlns:cx="http://schemas.microsoft.com/office/drawing/2014/chartex" xmlns:cx1="http://schemas.microsoft.com/office/drawing/2015/9/8/chartex" xmlns:cx2="http://schemas.microsoft.com/office/drawing/2015/10/21/chartex" xmlns:cx3="http://schemas.microsoft.com/office/drawing/2016/5/9/chartex" xmlns:cx4="http://schemas.microsoft.com/office/drawing/2016/5/10/chartex" xmlns:cx5="http://schemas.microsoft.com/office/drawing/2016/5/11/chartex" xmlns:cx6="http://schemas.microsoft.com/office/drawing/2016/5/12/chartex" xmlns:cx7="http://schemas.microsoft.com/office/drawing/2016/5/13/chartex" xmlns:cx8="http://schemas.microsoft.com/office/drawing/2016/5/14/chartex" xmlns:mc="http://schemas.openxmlformats.org/markup-compatibility/2006" xmlns:aink="http://schemas.microsoft.com/office/drawing/2016/ink" xmlns:am3d="http://schemas.microsoft.com/office/drawing/2017/model3d" xmlns:o="urn:schemas-microsoft-com:office:office" xmlns:oel="http://schemas.microsoft.com/office/2019/extlst" xmlns:r="http://schemas.openxmlformats.org/officeDocument/2006/relationships" xmlns:m="http://schemas.openxmlformats.org/officeDocument/2006/math" xmlns:v="urn:schemas-microsoft-com:vml" xmlns:wp14="http://schemas.microsoft.com/office/word/2010/wordprocessingDrawing" xmlns:wp="http://schemas.openxmlformats.org/drawingml/2006/wordprocessingDrawing" xmlns:w10="urn:schemas-microsoft-com:office:word" xmlns:w="http://schemas.openxmlformats.org/wordprocessingml/2006/main" xmlns:w14="http://schemas.microsoft.com/office/word/2010/wordml" xmlns:w15="http://schemas.microsoft.com/office/word/2012/wordml" xmlns:w16cex="http://schemas.microsoft.com/office/word/2018/wordml/cex" xmlns:w16cid="http://schemas.microsoft.com/office/word/2016/wordml/cid" xmlns:w16="http://schemas.microsoft.com/office/word/2018/wordml" xmlns:w16du="http://schemas.microsoft.com/office/word/2023/wordml/word16du" xmlns:w16sdtdh="http://schemas.microsoft.com/office/word/2020/wordml/sdtdatahash" xmlns:w16sdtfl="http://schemas.microsoft.com/office/word/2024/wordml/sdtformatlock" xmlns:w16se="http://schemas.microsoft.com/office/word/2015/wordml/symex" xmlns:wpg="http://schemas.microsoft.com/office/word/2010/wordprocessingGroup" xmlns:wpi="http://schemas.microsoft.com/office/word/2010/wordprocessingInk" xmlns:wne="http://schemas.microsoft.com/office/word/2006/wordml" xmlns:wps="http://schemas.microsoft.com/office/word/2010/wordprocessingShape" mc:Ignorable="w14 w15 w16se w16cid w16 w16cex w16sdtdh w16sdtfl w16du wp14">
   <w:footnote w:type="separator" w:id="-1">
     <w:p>
       <w:r>
@@ -6317,7 +6111,7 @@
 </file>
 
 <file path=word/numbering.xml><?xml version="1.0" encoding="utf-8"?>
-<w:numbering xmlns:wpc="http://schemas.microsoft.com/office/word/2010/wordprocessingCanvas" xmlns:cx="http://schemas.microsoft.com/office/drawing/2014/chartex" xmlns:cx1="http://schemas.microsoft.com/office/drawing/2015/9/8/chartex" xmlns:cx2="http://schemas.microsoft.com/office/drawing/2015/10/21/chartex" xmlns:cx3="http://schemas.microsoft.com/office/drawing/2016/5/9/chartex" xmlns:cx4="http://schemas.microsoft.com/office/drawing/2016/5/10/chartex" xmlns:cx5="http://schemas.microsoft.com/office/drawing/2016/5/11/chartex" xmlns:cx6="http://schemas.microsoft.com/office/drawing/2016/5/12/chartex" xmlns:cx7="http://schemas.microsoft.com/office/drawing/2016/5/13/chartex" xmlns:cx8="http://schemas.microsoft.com/office/drawing/2016/5/14/chartex" xmlns:mc="http://schemas.openxmlformats.org/markup-compatibility/2006" xmlns:aink="http://schemas.microsoft.com/office/drawing/2016/ink" xmlns:am3d="http://schemas.microsoft.com/office/drawing/2017/model3d" xmlns:o="urn:schemas-microsoft-com:office:office" xmlns:r="http://schemas.openxmlformats.org/officeDocument/2006/relationships" xmlns:m="http://schemas.openxmlformats.org/officeDocument/2006/math" xmlns:v="urn:schemas-microsoft-com:vml" xmlns:wp14="http://schemas.microsoft.com/office/word/2010/wordprocessingDrawing" xmlns:wp="http://schemas.openxmlformats.org/drawingml/2006/wordprocessingDrawing" xmlns:w10="urn:schemas-microsoft-com:office:word" xmlns:w="http://schemas.openxmlformats.org/wordprocessingml/2006/main" xmlns:w14="http://schemas.microsoft.com/office/word/2010/wordml" xmlns:w15="http://schemas.microsoft.com/office/word/2012/wordml" xmlns:w16cex="http://schemas.microsoft.com/office/word/2018/wordml/cex" xmlns:w16cid="http://schemas.microsoft.com/office/word/2016/wordml/cid" xmlns:w16="http://schemas.microsoft.com/office/word/2018/wordml" xmlns:w16se="http://schemas.microsoft.com/office/word/2015/wordml/symex" xmlns:wpg="http://schemas.microsoft.com/office/word/2010/wordprocessingGroup" xmlns:wpi="http://schemas.microsoft.com/office/word/2010/wordprocessingInk" xmlns:wne="http://schemas.microsoft.com/office/word/2006/wordml" xmlns:wps="http://schemas.microsoft.com/office/word/2010/wordprocessingShape" mc:Ignorable="w14 w15 w16se w16cid w16 w16cex wp14">
+<w:numbering xmlns:wpc="http://schemas.microsoft.com/office/word/2010/wordprocessingCanvas" xmlns:cx="http://schemas.microsoft.com/office/drawing/2014/chartex" xmlns:cx1="http://schemas.microsoft.com/office/drawing/2015/9/8/chartex" xmlns:cx2="http://schemas.microsoft.com/office/drawing/2015/10/21/chartex" xmlns:cx3="http://schemas.microsoft.com/office/drawing/2016/5/9/chartex" xmlns:cx4="http://schemas.microsoft.com/office/drawing/2016/5/10/chartex" xmlns:cx5="http://schemas.microsoft.com/office/drawing/2016/5/11/chartex" xmlns:cx6="http://schemas.microsoft.com/office/drawing/2016/5/12/chartex" xmlns:cx7="http://schemas.microsoft.com/office/drawing/2016/5/13/chartex" xmlns:cx8="http://schemas.microsoft.com/office/drawing/2016/5/14/chartex" xmlns:mc="http://schemas.openxmlformats.org/markup-compatibility/2006" xmlns:aink="http://schemas.microsoft.com/office/drawing/2016/ink" xmlns:am3d="http://schemas.microsoft.com/office/drawing/2017/model3d" xmlns:o="urn:schemas-microsoft-com:office:office" xmlns:oel="http://schemas.microsoft.com/office/2019/extlst" xmlns:r="http://schemas.openxmlformats.org/officeDocument/2006/relationships" xmlns:m="http://schemas.openxmlformats.org/officeDocument/2006/math" xmlns:v="urn:schemas-microsoft-com:vml" xmlns:wp14="http://schemas.microsoft.com/office/word/2010/wordprocessingDrawing" xmlns:wp="http://schemas.openxmlformats.org/drawingml/2006/wordprocessingDrawing" xmlns:w10="urn:schemas-microsoft-com:office:word" xmlns:w="http://schemas.openxmlformats.org/wordprocessingml/2006/main" xmlns:w14="http://schemas.microsoft.com/office/word/2010/wordml" xmlns:w15="http://schemas.microsoft.com/office/word/2012/wordml" xmlns:w16cex="http://schemas.microsoft.com/office/word/2018/wordml/cex" xmlns:w16cid="http://schemas.microsoft.com/office/word/2016/wordml/cid" xmlns:w16="http://schemas.microsoft.com/office/word/2018/wordml" xmlns:w16du="http://schemas.microsoft.com/office/word/2023/wordml/word16du" xmlns:w16sdtdh="http://schemas.microsoft.com/office/word/2020/wordml/sdtdatahash" xmlns:w16sdtfl="http://schemas.microsoft.com/office/word/2024/wordml/sdtformatlock" xmlns:w16se="http://schemas.microsoft.com/office/word/2015/wordml/symex" xmlns:wpg="http://schemas.microsoft.com/office/word/2010/wordprocessingGroup" xmlns:wpi="http://schemas.microsoft.com/office/word/2010/wordprocessingInk" xmlns:wne="http://schemas.microsoft.com/office/word/2006/wordml" xmlns:wps="http://schemas.microsoft.com/office/word/2010/wordprocessingShape" mc:Ignorable="w14 w15 w16se w16cid w16 w16cex w16sdtdh w16sdtfl w16du wp14">
   <w:abstractNum w:abstractNumId="0" w15:restartNumberingAfterBreak="0">
     <w:nsid w:val="05902273"/>
     <w:multiLevelType w:val="multilevel"/>
@@ -7082,32 +6876,32 @@
       </w:pPr>
     </w:lvl>
   </w:abstractNum>
-  <w:num w:numId="1">
+  <w:num w:numId="1" w16cid:durableId="1246500713">
     <w:abstractNumId w:val="4"/>
   </w:num>
-  <w:num w:numId="2">
+  <w:num w:numId="2" w16cid:durableId="1136027992">
     <w:abstractNumId w:val="5"/>
   </w:num>
-  <w:num w:numId="3">
+  <w:num w:numId="3" w16cid:durableId="551617">
     <w:abstractNumId w:val="1"/>
   </w:num>
-  <w:num w:numId="4">
+  <w:num w:numId="4" w16cid:durableId="572198797">
     <w:abstractNumId w:val="2"/>
   </w:num>
-  <w:num w:numId="5">
+  <w:num w:numId="5" w16cid:durableId="925307083">
     <w:abstractNumId w:val="3"/>
   </w:num>
-  <w:num w:numId="6">
+  <w:num w:numId="6" w16cid:durableId="1721634150">
     <w:abstractNumId w:val="0"/>
   </w:num>
-  <w:num w:numId="7">
+  <w:num w:numId="7" w16cid:durableId="1479495810">
     <w:abstractNumId w:val="6"/>
   </w:num>
 </w:numbering>
 </file>
 
 <file path=word/styles.xml><?xml version="1.0" encoding="utf-8"?>
-<w:styles xmlns:mc="http://schemas.openxmlformats.org/markup-compatibility/2006" xmlns:r="http://schemas.openxmlformats.org/officeDocument/2006/relationships" xmlns:w="http://schemas.openxmlformats.org/wordprocessingml/2006/main" xmlns:w14="http://schemas.microsoft.com/office/word/2010/wordml" xmlns:w15="http://schemas.microsoft.com/office/word/2012/wordml" xmlns:w16cex="http://schemas.microsoft.com/office/word/2018/wordml/cex" xmlns:w16cid="http://schemas.microsoft.com/office/word/2016/wordml/cid" xmlns:w16="http://schemas.microsoft.com/office/word/2018/wordml" xmlns:w16se="http://schemas.microsoft.com/office/word/2015/wordml/symex" mc:Ignorable="w14 w15 w16se w16cid w16 w16cex">
+<w:styles xmlns:mc="http://schemas.openxmlformats.org/markup-compatibility/2006" xmlns:r="http://schemas.openxmlformats.org/officeDocument/2006/relationships" xmlns:w="http://schemas.openxmlformats.org/wordprocessingml/2006/main" xmlns:w14="http://schemas.microsoft.com/office/word/2010/wordml" xmlns:w15="http://schemas.microsoft.com/office/word/2012/wordml" xmlns:w16cex="http://schemas.microsoft.com/office/word/2018/wordml/cex" xmlns:w16cid="http://schemas.microsoft.com/office/word/2016/wordml/cid" xmlns:w16="http://schemas.microsoft.com/office/word/2018/wordml" xmlns:w16du="http://schemas.microsoft.com/office/word/2023/wordml/word16du" xmlns:w16sdtdh="http://schemas.microsoft.com/office/word/2020/wordml/sdtdatahash" xmlns:w16sdtfl="http://schemas.microsoft.com/office/word/2024/wordml/sdtformatlock" xmlns:w16se="http://schemas.microsoft.com/office/word/2015/wordml/symex" mc:Ignorable="w14 w15 w16se w16cid w16 w16cex w16sdtdh w16sdtfl w16du">
   <w:docDefaults>
     <w:rPrDefault>
       <w:rPr>

</xml_diff>